<commit_message>
Informe de avance: retroalimentación y secciones de Julio completas
Co-Authored-By: Claude Sonnet 5.5 <noreply@anthropic.com>
</commit_message>
<xml_diff>
--- a/Fase 2/Evidencias Grupales/2.5_Informe_Avance_Proyecto_APT_AgeCare.docx
+++ b/Fase 2/Evidencias Grupales/2.5_Informe_Avance_Proyecto_APT_AgeCare.docx
@@ -203,7 +203,7 @@
       <w:r>
         <w:fldChar w:fldCharType="separate"/>
       </w:r>
-      <w:hyperlink w:anchor="_Toc243287382" w:history="1">
+      <w:hyperlink w:anchor="_Toc243287931" w:history="1">
         <w:r>
           <w:rPr>
             <w:rStyle w:val="Hipervnculo"/>
@@ -230,7 +230,7 @@
             <w:noProof/>
             <w:webHidden/>
           </w:rPr>
-          <w:instrText xml:space="preserve"> PAGEREF _Toc243287382 \h </w:instrText>
+          <w:instrText xml:space="preserve"> PAGEREF _Toc243287931 \h </w:instrText>
         </w:r>
         <w:r>
           <w:rPr>
@@ -271,7 +271,7 @@
           <w:noProof/>
         </w:rPr>
       </w:pPr>
-      <w:hyperlink w:anchor="_Toc243287383" w:history="1">
+      <w:hyperlink w:anchor="_Toc243287932" w:history="1">
         <w:r>
           <w:rPr>
             <w:rStyle w:val="Hipervnculo"/>
@@ -298,7 +298,7 @@
             <w:noProof/>
             <w:webHidden/>
           </w:rPr>
-          <w:instrText xml:space="preserve"> PAGEREF _Toc243287383 \h </w:instrText>
+          <w:instrText xml:space="preserve"> PAGEREF _Toc243287932 \h </w:instrText>
         </w:r>
         <w:r>
           <w:rPr>
@@ -339,7 +339,7 @@
           <w:noProof/>
         </w:rPr>
       </w:pPr>
-      <w:hyperlink w:anchor="_Toc243287384" w:history="1">
+      <w:hyperlink w:anchor="_Toc243287933" w:history="1">
         <w:r>
           <w:rPr>
             <w:rStyle w:val="Hipervnculo"/>
@@ -366,7 +366,7 @@
             <w:noProof/>
             <w:webHidden/>
           </w:rPr>
-          <w:instrText xml:space="preserve"> PAGEREF _Toc243287384 \h </w:instrText>
+          <w:instrText xml:space="preserve"> PAGEREF _Toc243287933 \h </w:instrText>
         </w:r>
         <w:r>
           <w:rPr>
@@ -407,7 +407,7 @@
           <w:noProof/>
         </w:rPr>
       </w:pPr>
-      <w:hyperlink w:anchor="_Toc243287385" w:history="1">
+      <w:hyperlink w:anchor="_Toc243287934" w:history="1">
         <w:r>
           <w:rPr>
             <w:rStyle w:val="Hipervnculo"/>
@@ -434,7 +434,7 @@
             <w:noProof/>
             <w:webHidden/>
           </w:rPr>
-          <w:instrText xml:space="preserve"> PAGEREF _Toc243287385 \h </w:instrText>
+          <w:instrText xml:space="preserve"> PAGEREF _Toc243287934 \h </w:instrText>
         </w:r>
         <w:r>
           <w:rPr>
@@ -475,7 +475,7 @@
           <w:noProof/>
         </w:rPr>
       </w:pPr>
-      <w:hyperlink w:anchor="_Toc243287386" w:history="1">
+      <w:hyperlink w:anchor="_Toc243287935" w:history="1">
         <w:r>
           <w:rPr>
             <w:rStyle w:val="Hipervnculo"/>
@@ -502,7 +502,7 @@
             <w:noProof/>
             <w:webHidden/>
           </w:rPr>
-          <w:instrText xml:space="preserve"> PAGEREF _Toc243287386 \h </w:instrText>
+          <w:instrText xml:space="preserve"> PAGEREF _Toc243287935 \h </w:instrText>
         </w:r>
         <w:r>
           <w:rPr>
@@ -543,7 +543,7 @@
           <w:noProof/>
         </w:rPr>
       </w:pPr>
-      <w:hyperlink w:anchor="_Toc243287387" w:history="1">
+      <w:hyperlink w:anchor="_Toc243287936" w:history="1">
         <w:r>
           <w:rPr>
             <w:rStyle w:val="Hipervnculo"/>
@@ -570,7 +570,7 @@
             <w:noProof/>
             <w:webHidden/>
           </w:rPr>
-          <w:instrText xml:space="preserve"> PAGEREF _Toc243287387 \h </w:instrText>
+          <w:instrText xml:space="preserve"> PAGEREF _Toc243287936 \h </w:instrText>
         </w:r>
         <w:r>
           <w:rPr>
@@ -611,7 +611,7 @@
           <w:noProof/>
         </w:rPr>
       </w:pPr>
-      <w:hyperlink w:anchor="_Toc243287388" w:history="1">
+      <w:hyperlink w:anchor="_Toc243287937" w:history="1">
         <w:r>
           <w:rPr>
             <w:rStyle w:val="Hipervnculo"/>
@@ -638,7 +638,7 @@
             <w:noProof/>
             <w:webHidden/>
           </w:rPr>
-          <w:instrText xml:space="preserve"> PAGEREF _Toc243287388 \h </w:instrText>
+          <w:instrText xml:space="preserve"> PAGEREF _Toc243287937 \h </w:instrText>
         </w:r>
         <w:r>
           <w:rPr>
@@ -679,7 +679,7 @@
           <w:noProof/>
         </w:rPr>
       </w:pPr>
-      <w:hyperlink w:anchor="_Toc243287389" w:history="1">
+      <w:hyperlink w:anchor="_Toc243287938" w:history="1">
         <w:r>
           <w:rPr>
             <w:rStyle w:val="Hipervnculo"/>
@@ -706,7 +706,7 @@
             <w:noProof/>
             <w:webHidden/>
           </w:rPr>
-          <w:instrText xml:space="preserve"> PAGEREF _Toc243287389 \h </w:instrText>
+          <w:instrText xml:space="preserve"> PAGEREF _Toc243287938 \h </w:instrText>
         </w:r>
         <w:r>
           <w:rPr>
@@ -747,7 +747,7 @@
           <w:noProof/>
         </w:rPr>
       </w:pPr>
-      <w:hyperlink w:anchor="_Toc243287390" w:history="1">
+      <w:hyperlink w:anchor="_Toc243287939" w:history="1">
         <w:r>
           <w:rPr>
             <w:rStyle w:val="Hipervnculo"/>
@@ -774,7 +774,7 @@
             <w:noProof/>
             <w:webHidden/>
           </w:rPr>
-          <w:instrText xml:space="preserve"> PAGEREF _Toc243287390 \h </w:instrText>
+          <w:instrText xml:space="preserve"> PAGEREF _Toc243287939 \h </w:instrText>
         </w:r>
         <w:r>
           <w:rPr>
@@ -815,7 +815,7 @@
           <w:noProof/>
         </w:rPr>
       </w:pPr>
-      <w:hyperlink w:anchor="_Toc243287391" w:history="1">
+      <w:hyperlink w:anchor="_Toc243287940" w:history="1">
         <w:r>
           <w:rPr>
             <w:rStyle w:val="Hipervnculo"/>
@@ -842,7 +842,7 @@
             <w:noProof/>
             <w:webHidden/>
           </w:rPr>
-          <w:instrText xml:space="preserve"> PAGEREF _Toc243287391 \h </w:instrText>
+          <w:instrText xml:space="preserve"> PAGEREF _Toc243287940 \h </w:instrText>
         </w:r>
         <w:r>
           <w:rPr>
@@ -883,7 +883,7 @@
           <w:noProof/>
         </w:rPr>
       </w:pPr>
-      <w:hyperlink w:anchor="_Toc243287392" w:history="1">
+      <w:hyperlink w:anchor="_Toc243287941" w:history="1">
         <w:r>
           <w:rPr>
             <w:rStyle w:val="Hipervnculo"/>
@@ -910,7 +910,7 @@
             <w:noProof/>
             <w:webHidden/>
           </w:rPr>
-          <w:instrText xml:space="preserve"> PAGEREF _Toc243287392 \h </w:instrText>
+          <w:instrText xml:space="preserve"> PAGEREF _Toc243287941 \h </w:instrText>
         </w:r>
         <w:r>
           <w:rPr>
@@ -951,7 +951,7 @@
           <w:noProof/>
         </w:rPr>
       </w:pPr>
-      <w:hyperlink w:anchor="_Toc243287393" w:history="1">
+      <w:hyperlink w:anchor="_Toc243287942" w:history="1">
         <w:r>
           <w:rPr>
             <w:rStyle w:val="Hipervnculo"/>
@@ -978,7 +978,7 @@
             <w:noProof/>
             <w:webHidden/>
           </w:rPr>
-          <w:instrText xml:space="preserve"> PAGEREF _Toc243287393 \h </w:instrText>
+          <w:instrText xml:space="preserve"> PAGEREF _Toc243287942 \h </w:instrText>
         </w:r>
         <w:r>
           <w:rPr>
@@ -1019,7 +1019,7 @@
           <w:noProof/>
         </w:rPr>
       </w:pPr>
-      <w:hyperlink w:anchor="_Toc243287394" w:history="1">
+      <w:hyperlink w:anchor="_Toc243287943" w:history="1">
         <w:r>
           <w:rPr>
             <w:rStyle w:val="Hipervnculo"/>
@@ -1046,7 +1046,7 @@
             <w:noProof/>
             <w:webHidden/>
           </w:rPr>
-          <w:instrText xml:space="preserve"> PAGEREF _Toc243287394 \h </w:instrText>
+          <w:instrText xml:space="preserve"> PAGEREF _Toc243287943 \h </w:instrText>
         </w:r>
         <w:r>
           <w:rPr>
@@ -1087,7 +1087,7 @@
           <w:noProof/>
         </w:rPr>
       </w:pPr>
-      <w:hyperlink w:anchor="_Toc243287395" w:history="1">
+      <w:hyperlink w:anchor="_Toc243287944" w:history="1">
         <w:r>
           <w:rPr>
             <w:rStyle w:val="Hipervnculo"/>
@@ -1114,7 +1114,7 @@
             <w:noProof/>
             <w:webHidden/>
           </w:rPr>
-          <w:instrText xml:space="preserve"> PAGEREF _Toc243287395 \h </w:instrText>
+          <w:instrText xml:space="preserve"> PAGEREF _Toc243287944 \h </w:instrText>
         </w:r>
         <w:r>
           <w:rPr>
@@ -1155,7 +1155,7 @@
           <w:noProof/>
         </w:rPr>
       </w:pPr>
-      <w:hyperlink w:anchor="_Toc243287396" w:history="1">
+      <w:hyperlink w:anchor="_Toc243287945" w:history="1">
         <w:r>
           <w:rPr>
             <w:rStyle w:val="Hipervnculo"/>
@@ -1182,7 +1182,7 @@
             <w:noProof/>
             <w:webHidden/>
           </w:rPr>
-          <w:instrText xml:space="preserve"> PAGEREF _Toc243287396 \h </w:instrText>
+          <w:instrText xml:space="preserve"> PAGEREF _Toc243287945 \h </w:instrText>
         </w:r>
         <w:r>
           <w:rPr>
@@ -1223,7 +1223,7 @@
           <w:noProof/>
         </w:rPr>
       </w:pPr>
-      <w:hyperlink w:anchor="_Toc243287397" w:history="1">
+      <w:hyperlink w:anchor="_Toc243287946" w:history="1">
         <w:r>
           <w:rPr>
             <w:rStyle w:val="Hipervnculo"/>
@@ -1250,7 +1250,7 @@
             <w:noProof/>
             <w:webHidden/>
           </w:rPr>
-          <w:instrText xml:space="preserve"> PAGEREF _Toc243287397 \h </w:instrText>
+          <w:instrText xml:space="preserve"> PAGEREF _Toc243287946 \h </w:instrText>
         </w:r>
         <w:r>
           <w:rPr>
@@ -1291,7 +1291,7 @@
           <w:noProof/>
         </w:rPr>
       </w:pPr>
-      <w:hyperlink w:anchor="_Toc243287398" w:history="1">
+      <w:hyperlink w:anchor="_Toc243287947" w:history="1">
         <w:r>
           <w:rPr>
             <w:rStyle w:val="Hipervnculo"/>
@@ -1318,7 +1318,7 @@
             <w:noProof/>
             <w:webHidden/>
           </w:rPr>
-          <w:instrText xml:space="preserve"> PAGEREF _Toc243287398 \h </w:instrText>
+          <w:instrText xml:space="preserve"> PAGEREF _Toc243287947 \h </w:instrText>
         </w:r>
         <w:r>
           <w:rPr>
@@ -1359,7 +1359,7 @@
           <w:noProof/>
         </w:rPr>
       </w:pPr>
-      <w:hyperlink w:anchor="_Toc243287399" w:history="1">
+      <w:hyperlink w:anchor="_Toc243287948" w:history="1">
         <w:r>
           <w:rPr>
             <w:rStyle w:val="Hipervnculo"/>
@@ -1386,7 +1386,7 @@
             <w:noProof/>
             <w:webHidden/>
           </w:rPr>
-          <w:instrText xml:space="preserve"> PAGEREF _Toc243287399 \h </w:instrText>
+          <w:instrText xml:space="preserve"> PAGEREF _Toc243287948 \h </w:instrText>
         </w:r>
         <w:r>
           <w:rPr>
@@ -1427,7 +1427,7 @@
           <w:noProof/>
         </w:rPr>
       </w:pPr>
-      <w:hyperlink w:anchor="_Toc243287400" w:history="1">
+      <w:hyperlink w:anchor="_Toc243287949" w:history="1">
         <w:r>
           <w:rPr>
             <w:rStyle w:val="Hipervnculo"/>
@@ -1454,7 +1454,7 @@
             <w:noProof/>
             <w:webHidden/>
           </w:rPr>
-          <w:instrText xml:space="preserve"> PAGEREF _Toc243287400 \h </w:instrText>
+          <w:instrText xml:space="preserve"> PAGEREF _Toc243287949 \h </w:instrText>
         </w:r>
         <w:r>
           <w:rPr>
@@ -1495,7 +1495,7 @@
           <w:noProof/>
         </w:rPr>
       </w:pPr>
-      <w:hyperlink w:anchor="_Toc243287401" w:history="1">
+      <w:hyperlink w:anchor="_Toc243287950" w:history="1">
         <w:r>
           <w:rPr>
             <w:rStyle w:val="Hipervnculo"/>
@@ -1522,7 +1522,7 @@
             <w:noProof/>
             <w:webHidden/>
           </w:rPr>
-          <w:instrText xml:space="preserve"> PAGEREF _Toc243287401 \h </w:instrText>
+          <w:instrText xml:space="preserve"> PAGEREF _Toc243287950 \h </w:instrText>
         </w:r>
         <w:r>
           <w:rPr>
@@ -1563,7 +1563,7 @@
           <w:noProof/>
         </w:rPr>
       </w:pPr>
-      <w:hyperlink w:anchor="_Toc243287402" w:history="1">
+      <w:hyperlink w:anchor="_Toc243287951" w:history="1">
         <w:r>
           <w:rPr>
             <w:rStyle w:val="Hipervnculo"/>
@@ -1590,7 +1590,7 @@
             <w:noProof/>
             <w:webHidden/>
           </w:rPr>
-          <w:instrText xml:space="preserve"> PAGEREF _Toc243287402 \h </w:instrText>
+          <w:instrText xml:space="preserve"> PAGEREF _Toc243287951 \h </w:instrText>
         </w:r>
         <w:r>
           <w:rPr>
@@ -1631,7 +1631,7 @@
           <w:noProof/>
         </w:rPr>
       </w:pPr>
-      <w:hyperlink w:anchor="_Toc243287403" w:history="1">
+      <w:hyperlink w:anchor="_Toc243287952" w:history="1">
         <w:r>
           <w:rPr>
             <w:rStyle w:val="Hipervnculo"/>
@@ -1658,7 +1658,7 @@
             <w:noProof/>
             <w:webHidden/>
           </w:rPr>
-          <w:instrText xml:space="preserve"> PAGEREF _Toc243287403 \h </w:instrText>
+          <w:instrText xml:space="preserve"> PAGEREF _Toc243287952 \h </w:instrText>
         </w:r>
         <w:r>
           <w:rPr>
@@ -1699,7 +1699,7 @@
           <w:noProof/>
         </w:rPr>
       </w:pPr>
-      <w:hyperlink w:anchor="_Toc243287404" w:history="1">
+      <w:hyperlink w:anchor="_Toc243287953" w:history="1">
         <w:r>
           <w:rPr>
             <w:rStyle w:val="Hipervnculo"/>
@@ -1726,7 +1726,7 @@
             <w:noProof/>
             <w:webHidden/>
           </w:rPr>
-          <w:instrText xml:space="preserve"> PAGEREF _Toc243287404 \h </w:instrText>
+          <w:instrText xml:space="preserve"> PAGEREF _Toc243287953 \h </w:instrText>
         </w:r>
         <w:r>
           <w:rPr>
@@ -1767,7 +1767,7 @@
           <w:noProof/>
         </w:rPr>
       </w:pPr>
-      <w:hyperlink w:anchor="_Toc243287405" w:history="1">
+      <w:hyperlink w:anchor="_Toc243287954" w:history="1">
         <w:r>
           <w:rPr>
             <w:rStyle w:val="Hipervnculo"/>
@@ -1794,7 +1794,7 @@
             <w:noProof/>
             <w:webHidden/>
           </w:rPr>
-          <w:instrText xml:space="preserve"> PAGEREF _Toc243287405 \h </w:instrText>
+          <w:instrText xml:space="preserve"> PAGEREF _Toc243287954 \h </w:instrText>
         </w:r>
         <w:r>
           <w:rPr>
@@ -1835,7 +1835,7 @@
           <w:noProof/>
         </w:rPr>
       </w:pPr>
-      <w:hyperlink w:anchor="_Toc243287406" w:history="1">
+      <w:hyperlink w:anchor="_Toc243287955" w:history="1">
         <w:r>
           <w:rPr>
             <w:rStyle w:val="Hipervnculo"/>
@@ -1862,7 +1862,7 @@
             <w:noProof/>
             <w:webHidden/>
           </w:rPr>
-          <w:instrText xml:space="preserve"> PAGEREF _Toc243287406 \h </w:instrText>
+          <w:instrText xml:space="preserve"> PAGEREF _Toc243287955 \h </w:instrText>
         </w:r>
         <w:r>
           <w:rPr>
@@ -1903,7 +1903,7 @@
           <w:noProof/>
         </w:rPr>
       </w:pPr>
-      <w:hyperlink w:anchor="_Toc243287407" w:history="1">
+      <w:hyperlink w:anchor="_Toc243287956" w:history="1">
         <w:r>
           <w:rPr>
             <w:rStyle w:val="Hipervnculo"/>
@@ -1930,7 +1930,7 @@
             <w:noProof/>
             <w:webHidden/>
           </w:rPr>
-          <w:instrText xml:space="preserve"> PAGEREF _Toc243287407 \h </w:instrText>
+          <w:instrText xml:space="preserve"> PAGEREF _Toc243287956 \h </w:instrText>
         </w:r>
         <w:r>
           <w:rPr>
@@ -1971,7 +1971,7 @@
           <w:noProof/>
         </w:rPr>
       </w:pPr>
-      <w:hyperlink w:anchor="_Toc243287408" w:history="1">
+      <w:hyperlink w:anchor="_Toc243287957" w:history="1">
         <w:r>
           <w:rPr>
             <w:rStyle w:val="Hipervnculo"/>
@@ -1998,7 +1998,7 @@
             <w:noProof/>
             <w:webHidden/>
           </w:rPr>
-          <w:instrText xml:space="preserve"> PAGEREF _Toc243287408 \h </w:instrText>
+          <w:instrText xml:space="preserve"> PAGEREF _Toc243287957 \h </w:instrText>
         </w:r>
         <w:r>
           <w:rPr>
@@ -2039,7 +2039,7 @@
           <w:noProof/>
         </w:rPr>
       </w:pPr>
-      <w:hyperlink w:anchor="_Toc243287409" w:history="1">
+      <w:hyperlink w:anchor="_Toc243287958" w:history="1">
         <w:r>
           <w:rPr>
             <w:rStyle w:val="Hipervnculo"/>
@@ -2066,7 +2066,7 @@
             <w:noProof/>
             <w:webHidden/>
           </w:rPr>
-          <w:instrText xml:space="preserve"> PAGEREF _Toc243287409 \h </w:instrText>
+          <w:instrText xml:space="preserve"> PAGEREF _Toc243287958 \h </w:instrText>
         </w:r>
         <w:r>
           <w:rPr>
@@ -2086,7 +2086,7 @@
             <w:noProof/>
             <w:webHidden/>
           </w:rPr>
-          <w:t>13</w:t>
+          <w:t>14</w:t>
         </w:r>
         <w:r>
           <w:rPr>
@@ -2107,7 +2107,7 @@
           <w:noProof/>
         </w:rPr>
       </w:pPr>
-      <w:hyperlink w:anchor="_Toc243287410" w:history="1">
+      <w:hyperlink w:anchor="_Toc243287959" w:history="1">
         <w:r>
           <w:rPr>
             <w:rStyle w:val="Hipervnculo"/>
@@ -2134,7 +2134,7 @@
             <w:noProof/>
             <w:webHidden/>
           </w:rPr>
-          <w:instrText xml:space="preserve"> PAGEREF _Toc243287410 \h </w:instrText>
+          <w:instrText xml:space="preserve"> PAGEREF _Toc243287959 \h </w:instrText>
         </w:r>
         <w:r>
           <w:rPr>
@@ -2154,7 +2154,7 @@
             <w:noProof/>
             <w:webHidden/>
           </w:rPr>
-          <w:t>14</w:t>
+          <w:t>15</w:t>
         </w:r>
         <w:r>
           <w:rPr>
@@ -2182,7 +2182,7 @@
       <w:pPr>
         <w:pStyle w:val="Ttulo1"/>
       </w:pPr>
-      <w:bookmarkStart w:id="0" w:name="_Toc243287382"/>
+      <w:bookmarkStart w:id="0" w:name="_Toc243287931"/>
       <w:r>
         <w:lastRenderedPageBreak/>
         <w:t>Abstract (español)</w:t>
@@ -2215,7 +2215,7 @@
       <w:pPr>
         <w:pStyle w:val="Ttulo1"/>
       </w:pPr>
-      <w:bookmarkStart w:id="1" w:name="_Toc243287383"/>
+      <w:bookmarkStart w:id="1" w:name="_Toc243287932"/>
       <w:r>
         <w:t>Abstract (English)</w:t>
       </w:r>
@@ -2252,7 +2252,7 @@
       <w:pPr>
         <w:pStyle w:val="Ttulo1"/>
       </w:pPr>
-      <w:bookmarkStart w:id="2" w:name="_Toc243287384"/>
+      <w:bookmarkStart w:id="2" w:name="_Toc243287933"/>
       <w:r>
         <w:lastRenderedPageBreak/>
         <w:t>1. Introducción y contexto</w:t>
@@ -2276,7 +2276,7 @@
       <w:pPr>
         <w:pStyle w:val="Ttulo2"/>
       </w:pPr>
-      <w:bookmarkStart w:id="3" w:name="_Toc243287385"/>
+      <w:bookmarkStart w:id="3" w:name="_Toc243287934"/>
       <w:r>
         <w:t>1.1 Objetivos</w:t>
       </w:r>
@@ -2363,7 +2363,7 @@
       <w:pPr>
         <w:pStyle w:val="Ttulo1"/>
       </w:pPr>
-      <w:bookmarkStart w:id="4" w:name="_Toc243287386"/>
+      <w:bookmarkStart w:id="4" w:name="_Toc243287935"/>
       <w:r>
         <w:lastRenderedPageBreak/>
         <w:t>2. Metodología de trabajo</w:t>
@@ -2374,7 +2374,7 @@
       <w:pPr>
         <w:pStyle w:val="Ttulo2"/>
       </w:pPr>
-      <w:bookmarkStart w:id="5" w:name="_Toc243287387"/>
+      <w:bookmarkStart w:id="5" w:name="_Toc243287936"/>
       <w:r>
         <w:t>2.1 Enfoque</w:t>
       </w:r>
@@ -2389,7 +2389,7 @@
       <w:pPr>
         <w:pStyle w:val="Ttulo2"/>
       </w:pPr>
-      <w:bookmarkStart w:id="6" w:name="_Toc243287388"/>
+      <w:bookmarkStart w:id="6" w:name="_Toc243287937"/>
       <w:r>
         <w:t>2.2 Prácticas técnicas</w:t>
       </w:r>
@@ -2489,7 +2489,7 @@
       <w:pPr>
         <w:pStyle w:val="Ttulo2"/>
       </w:pPr>
-      <w:bookmarkStart w:id="7" w:name="_Toc243287389"/>
+      <w:bookmarkStart w:id="7" w:name="_Toc243287938"/>
       <w:r>
         <w:t>2.3 Pertinencia de la metodología</w:t>
       </w:r>
@@ -2504,7 +2504,7 @@
       <w:pPr>
         <w:pStyle w:val="Ttulo1"/>
       </w:pPr>
-      <w:bookmarkStart w:id="8" w:name="_Toc243287390"/>
+      <w:bookmarkStart w:id="8" w:name="_Toc243287939"/>
       <w:r>
         <w:lastRenderedPageBreak/>
         <w:t>3. Desarrollo de ingeniería</w:t>
@@ -2515,7 +2515,7 @@
       <w:pPr>
         <w:pStyle w:val="Ttulo2"/>
       </w:pPr>
-      <w:bookmarkStart w:id="9" w:name="_Toc243287391"/>
+      <w:bookmarkStart w:id="9" w:name="_Toc243287940"/>
       <w:r>
         <w:t>3.1 Estado frente al plan de trabajo</w:t>
       </w:r>
@@ -3162,7 +3162,7 @@
       <w:pPr>
         <w:pStyle w:val="Ttulo2"/>
       </w:pPr>
-      <w:bookmarkStart w:id="10" w:name="_Toc243287392"/>
+      <w:bookmarkStart w:id="10" w:name="_Toc243287941"/>
       <w:r>
         <w:t>3.2 Evidencias de documentación</w:t>
       </w:r>
@@ -3247,7 +3247,7 @@
       <w:pPr>
         <w:pStyle w:val="Ttulo2"/>
       </w:pPr>
-      <w:bookmarkStart w:id="11" w:name="_Toc243287393"/>
+      <w:bookmarkStart w:id="11" w:name="_Toc243287942"/>
       <w:r>
         <w:t>3.3 Evidencias de programación</w:t>
       </w:r>
@@ -3721,7 +3721,7 @@
       <w:pPr>
         <w:pStyle w:val="Ttulo2"/>
       </w:pPr>
-      <w:bookmarkStart w:id="12" w:name="_Toc243287394"/>
+      <w:bookmarkStart w:id="12" w:name="_Toc243287943"/>
       <w:r>
         <w:t>3.4 Evidencias de almacenamiento de datos</w:t>
       </w:r>
@@ -4041,7 +4041,7 @@
       <w:pPr>
         <w:pStyle w:val="Ttulo2"/>
       </w:pPr>
-      <w:bookmarkStart w:id="13" w:name="_Toc243287395"/>
+      <w:bookmarkStart w:id="13" w:name="_Toc243287944"/>
       <w:r>
         <w:t>3.5 Pruebas y estándares de calidad</w:t>
       </w:r>
@@ -4059,7 +4059,7 @@
       <w:pPr>
         <w:pStyle w:val="Ttulo2"/>
       </w:pPr>
-      <w:bookmarkStart w:id="14" w:name="_Toc243287396"/>
+      <w:bookmarkStart w:id="14" w:name="_Toc243287945"/>
       <w:r>
         <w:t>3.6 Indicadores de calidad por competencia del perfil de egreso</w:t>
       </w:r>
@@ -4420,7 +4420,7 @@
       <w:pPr>
         <w:pStyle w:val="Ttulo1"/>
       </w:pPr>
-      <w:bookmarkStart w:id="15" w:name="_Toc243287397"/>
+      <w:bookmarkStart w:id="15" w:name="_Toc243287946"/>
       <w:r>
         <w:lastRenderedPageBreak/>
         <w:t>4. Ajustes a la propuesta</w:t>
@@ -4787,7 +4787,7 @@
       <w:pPr>
         <w:pStyle w:val="Ttulo2"/>
       </w:pPr>
-      <w:bookmarkStart w:id="16" w:name="_Toc243287398"/>
+      <w:bookmarkStart w:id="16" w:name="_Toc243287947"/>
       <w:r>
         <w:t>4.1 Facilitadores y dificultades</w:t>
       </w:r>
@@ -4819,7 +4819,7 @@
       <w:pPr>
         <w:pStyle w:val="Ttulo2"/>
       </w:pPr>
-      <w:bookmarkStart w:id="17" w:name="_Toc243287399"/>
+      <w:bookmarkStart w:id="17" w:name="_Toc243287948"/>
       <w:r>
         <w:t>4.2 Retroalimentación</w:t>
       </w:r>
@@ -4827,17 +4827,14 @@
     </w:p>
     <w:p>
       <w:r>
-        <w:rPr>
-          <w:highlight w:val="yellow"/>
-        </w:rPr>
-        <w:t>[Completar: retroalimentación recibida del docente o de la contraparte y el ajuste que se hizo a partir de ella. Si aún no hay retroalimentación escrita, indicarlo y decir que se incorporará en la entrega final.]</w:t>
+        <w:t>La retroalimentación que se reciba del docente a partir de esta evaluación se incorporará en la entrega final del proyecto.</w:t>
       </w:r>
     </w:p>
     <w:p>
       <w:pPr>
         <w:pStyle w:val="Ttulo1"/>
       </w:pPr>
-      <w:bookmarkStart w:id="18" w:name="_Toc243287400"/>
+      <w:bookmarkStart w:id="18" w:name="_Toc243287949"/>
       <w:r>
         <w:t>5. Trabajo en equipo y aporte de cada integrante</w:t>
       </w:r>
@@ -4997,18 +4994,10 @@
       </w:pPr>
     </w:p>
     <w:p>
-      <w:r>
-        <w:rPr>
-          <w:highlight w:val="yellow"/>
-        </w:rPr>
-        <w:t>[Completar con Julio: si hay aportes que no se ven en los commits (pruebas manuales, documentación, revisión), indicarlos aquí.]</w:t>
-      </w:r>
-    </w:p>
-    <w:p>
       <w:pPr>
         <w:pStyle w:val="Ttulo1"/>
       </w:pPr>
-      <w:bookmarkStart w:id="19" w:name="_Toc243287401"/>
+      <w:bookmarkStart w:id="19" w:name="_Toc243287950"/>
       <w:r>
         <w:t>6. Cómo revisar el proyecto en línea</w:t>
       </w:r>
@@ -5292,7 +5281,7 @@
       <w:pPr>
         <w:pStyle w:val="Ttulo1"/>
       </w:pPr>
-      <w:bookmarkStart w:id="20" w:name="_Toc243287402"/>
+      <w:bookmarkStart w:id="20" w:name="_Toc243287951"/>
       <w:r>
         <w:t>7. Próximos pasos</w:t>
       </w:r>
@@ -5338,7 +5327,7 @@
       <w:pPr>
         <w:pStyle w:val="Ttulo1"/>
       </w:pPr>
-      <w:bookmarkStart w:id="21" w:name="_Toc243287403"/>
+      <w:bookmarkStart w:id="21" w:name="_Toc243287952"/>
       <w:r>
         <w:t>8. Individual conclusions</w:t>
       </w:r>
@@ -5348,7 +5337,7 @@
       <w:pPr>
         <w:pStyle w:val="Ttulo2"/>
       </w:pPr>
-      <w:bookmarkStart w:id="22" w:name="_Toc243287404"/>
+      <w:bookmarkStart w:id="22" w:name="_Toc243287953"/>
       <w:r>
         <w:t>8.1 Bryan Alexander Piña Frías</w:t>
       </w:r>
@@ -5359,15 +5348,12 @@
         <w:t xml:space="preserve">AgeCare has moved from a plan to a working system. The six endpoints we committed to in Phase 1 are implemented and tested, and the Administration Console is live on Vercel with its data in Supabase. The most valuable technical lesson for me was data modelling: deciding how reviews, points and documents relate to each other and enforcing the business rules on the server. A review is only allowed after a job has ended, a caregiver is published only after the staff approves her documents, and a caregiver can </w:t>
       </w:r>
       <w:r>
-        <w:t xml:space="preserve">only </w:t>
-      </w:r>
+        <w:t>only have one active job. Putting those rules in the backend and covering them with automated tests made the system safer to change.</w:t>
+      </w:r>
+    </w:p>
+    <w:p>
       <w:r>
         <w:lastRenderedPageBreak/>
-        <w:t>have one active job. Putting those rules in the backend and covering them with automated tests made the system safer to change.</w:t>
-      </w:r>
-    </w:p>
-    <w:p>
-      <w:r>
         <w:t>The second lesson is that an application that works on my computer is not yet a finished product. Most of my difficulties appeared during deployment: routing errors, a Python version that rejected code my local version accepted, a missing dependency and notifications that were lost between the two APIs. Solving them taught me to test in a clean environment before publishing and to design the integration so that each system can recover on its own.</w:t>
       </w:r>
     </w:p>
@@ -5380,7 +5366,7 @@
       <w:pPr>
         <w:pStyle w:val="Ttulo2"/>
       </w:pPr>
-      <w:bookmarkStart w:id="23" w:name="_Toc243287405"/>
+      <w:bookmarkStart w:id="23" w:name="_Toc243287954"/>
       <w:r>
         <w:t>8.2 Julio Lorenzo Muñoz Rojas</w:t>
       </w:r>
@@ -5388,17 +5374,27 @@
     </w:p>
     <w:p>
       <w:r>
-        <w:rPr>
-          <w:highlight w:val="yellow"/>
-        </w:rPr>
-        <w:t>[To be written by Julio, in English: his conclusions about the technical results, what he learned and what is still pending.]</w:t>
+        <w:t>In this phase my work focused on the public website, the part of AgeCare that families and caregivers actually use. I built the caregiver's professional profile form, the profile photo upload, the document upload with its review status and the redesign of the home page. More recently I added the verified-caregiver badge, the profile completeness indicator and the marker that shows which older adults already have a caregiver in the family view. Each of these features touches the database, the API and the int</w:t>
+      </w:r>
+      <w:r>
+        <w:t>erface, so I worked across the whole stack with FastAPI and PostgreSQL, as I had planned in Phase 1.</w:t>
+      </w:r>
+    </w:p>
+    <w:p>
+      <w:r>
+        <w:t>The result can be seen in the system: a caregiver can complete her profile, upload her documents and check whether the staff approved them, and the staff can review them from the Console. Some of my changes to the profile form also affected the synchronization between the two backends, so I had to keep both sides consistent. This showed me that the data a user uploads must be validated and traceable: each document has a status and the system keeps the approved file until the staff accepts a new one.</w:t>
+      </w:r>
+    </w:p>
+    <w:p>
+      <w:r>
+        <w:t>For the final delivery I want to review the complete caregiver flow from registration to hiring requests and support the recorded demo, so that the work of the whole team is easy to follow.</w:t>
       </w:r>
     </w:p>
     <w:p>
       <w:pPr>
         <w:pStyle w:val="Ttulo1"/>
       </w:pPr>
-      <w:bookmarkStart w:id="24" w:name="_Toc243287406"/>
+      <w:bookmarkStart w:id="24" w:name="_Toc243287955"/>
       <w:r>
         <w:t>9. Individual reflection</w:t>
       </w:r>
@@ -5408,7 +5404,7 @@
       <w:pPr>
         <w:pStyle w:val="Ttulo2"/>
       </w:pPr>
-      <w:bookmarkStart w:id="25" w:name="_Toc243287407"/>
+      <w:bookmarkStart w:id="25" w:name="_Toc243287956"/>
       <w:r>
         <w:t>9.1 Bryan Alexander Piña Frías</w:t>
       </w:r>
@@ -5416,10 +5412,11 @@
     </w:p>
     <w:p>
       <w:r>
-        <w:t>At the beginning of the semester I described my strengths as databases, backend development and project coordination, and my main weakness as writing complete applications from scratch. This phase tested both. Building the console, two APIs and a public website forced me to write much more application code than I expected, and I now feel more confident doing it. I also learned that planning is not only a Gantt chart: the scope grew when we added the public website, and I had to adjust the plan instead of ig</w:t>
-      </w:r>
-      <w:r>
-        <w:t>noring the change.</w:t>
+        <w:t xml:space="preserve">At the beginning of the semester I described my strengths as databases, backend development and project coordination, and my main weakness as writing complete applications from scratch. This phase tested both. Building the console, two APIs and a public website forced me to write much more application code than I expected, and I now feel more confident doing it. I also learned that planning is </w:t>
+      </w:r>
+      <w:r>
+        <w:lastRenderedPageBreak/>
+        <w:t>not only a Gantt chart: the scope grew when we added the public website, and I had to adjust the plan instead of ignoring the change.</w:t>
       </w:r>
     </w:p>
     <w:p>
@@ -5436,27 +5433,42 @@
       <w:pPr>
         <w:pStyle w:val="Ttulo2"/>
       </w:pPr>
-      <w:bookmarkStart w:id="26" w:name="_Toc243287408"/>
+      <w:bookmarkStart w:id="26" w:name="_Toc243287957"/>
+      <w:r>
+        <w:t>9.2 Julio Lorenzo Muñoz Rojas</w:t>
+      </w:r>
+      <w:bookmarkEnd w:id="26"/>
+    </w:p>
+    <w:p>
+      <w:r>
+        <w:t>In Phase 1 I said that my strengths were data modelling, SQL and Python, and that I needed to improve testing and quality, security and project management. This phase gave me practice in some of these areas. Designing the document upload showed me that data quality starts when the data enters the system: I had to decide which file types are accepted, which size is allowed and how to show the review status to the user. This connects with my interest in data governance, because it is about traceability and tr</w:t>
+      </w:r>
+      <w:r>
+        <w:t>ustworthy information.</w:t>
+      </w:r>
+    </w:p>
+    <w:p>
+      <w:r>
+        <w:t>I also understood why automated tests matter. The team now has 50 of them, and they allow us to change rules without breaking previous features. Until now I had mostly tested manually, so in the next weeks I want to learn to write tests myself, starting with the profile and document flows I worked on.</w:t>
+      </w:r>
+    </w:p>
+    <w:p>
+      <w:r>
+        <w:t>The main difficulty for me was time: combining the project with work, other courses and the search for a professional internship. We handled it by dividing the tasks week by week, and when one of us had a heavier week the other moved some tasks forward. For the final stretch I plan to leave a margin before each delivery for tests and corrections, and to document better what I do.</w:t>
+      </w:r>
+    </w:p>
+    <w:p>
+      <w:r>
+        <w:t>Regarding teamwork, we split the work by areas: I took the caregiver's profile and the home page, and Bryan took the console, the APIs and the deployment. Communication has been good and we ask each other for help when something does not work, but we could hold follow-up meetings more regularly and keep a record of what we decide. From this phase I keep the idea that I like building features that handle real user data, which is close to my interest in data work.</w:t>
+      </w:r>
+    </w:p>
+    <w:p>
+      <w:pPr>
+        <w:pStyle w:val="Ttulo1"/>
+      </w:pPr>
+      <w:bookmarkStart w:id="27" w:name="_Toc243287958"/>
       <w:r>
         <w:lastRenderedPageBreak/>
-        <w:t>9.2 Julio Lorenzo Muñoz Rojas</w:t>
-      </w:r>
-      <w:bookmarkEnd w:id="26"/>
-    </w:p>
-    <w:p>
-      <w:r>
-        <w:rPr>
-          <w:highlight w:val="yellow"/>
-        </w:rPr>
-        <w:t>[To be written by Julio, in English: his own reflection about the process, the teamwork and his professional interests.]</w:t>
-      </w:r>
-    </w:p>
-    <w:p>
-      <w:pPr>
-        <w:pStyle w:val="Ttulo1"/>
-      </w:pPr>
-      <w:bookmarkStart w:id="27" w:name="_Toc243287409"/>
-      <w:r>
         <w:t>Referencias</w:t>
       </w:r>
       <w:bookmarkEnd w:id="27"/>
@@ -5520,7 +5532,7 @@
       <w:pPr>
         <w:pStyle w:val="Ttulo1"/>
       </w:pPr>
-      <w:bookmarkStart w:id="28" w:name="_Toc243287410"/>
+      <w:bookmarkStart w:id="28" w:name="_Toc243287959"/>
       <w:r>
         <w:lastRenderedPageBreak/>
         <w:t>Anexo A. Evidencias del sistema</w:t>
@@ -5546,7 +5558,7 @@
           <w:noProof/>
         </w:rPr>
         <w:drawing>
-          <wp:inline distT="0" distB="0" distL="0" distR="0" wp14:anchorId="2BD53920" wp14:editId="2DFD493B">
+          <wp:inline distT="0" distB="0" distL="0" distR="0" wp14:anchorId="5C1DCC32" wp14:editId="7E2F8D1A">
             <wp:extent cx="4860000" cy="3037500"/>
             <wp:effectExtent l="0" t="0" r="0" b="0"/>
             <wp:docPr id="1" name="Picture 1"/>
@@ -5602,7 +5614,7 @@
           <w:noProof/>
         </w:rPr>
         <w:drawing>
-          <wp:inline distT="0" distB="0" distL="0" distR="0" wp14:anchorId="68EF36A5" wp14:editId="3C104C75">
+          <wp:inline distT="0" distB="0" distL="0" distR="0" wp14:anchorId="014510B7" wp14:editId="519EF01B">
             <wp:extent cx="4860000" cy="3037500"/>
             <wp:effectExtent l="0" t="0" r="0" b="0"/>
             <wp:docPr id="2" name="Picture 2"/>
@@ -5659,7 +5671,7 @@
         </w:rPr>
         <w:lastRenderedPageBreak/>
         <w:drawing>
-          <wp:inline distT="0" distB="0" distL="0" distR="0" wp14:anchorId="5851E949" wp14:editId="596F8BFB">
+          <wp:inline distT="0" distB="0" distL="0" distR="0" wp14:anchorId="596E1B6B" wp14:editId="701EB47B">
             <wp:extent cx="4860000" cy="3037500"/>
             <wp:effectExtent l="0" t="0" r="0" b="0"/>
             <wp:docPr id="3" name="Picture 3"/>
@@ -5715,7 +5727,7 @@
           <w:noProof/>
         </w:rPr>
         <w:drawing>
-          <wp:inline distT="0" distB="0" distL="0" distR="0" wp14:anchorId="2759FCB1" wp14:editId="423FEA57">
+          <wp:inline distT="0" distB="0" distL="0" distR="0" wp14:anchorId="64FEC001" wp14:editId="1C18C0CE">
             <wp:extent cx="4860000" cy="3375000"/>
             <wp:effectExtent l="0" t="0" r="0" b="0"/>
             <wp:docPr id="4" name="Picture 4"/>
@@ -5772,7 +5784,7 @@
         </w:rPr>
         <w:lastRenderedPageBreak/>
         <w:drawing>
-          <wp:inline distT="0" distB="0" distL="0" distR="0" wp14:anchorId="290DF5DB" wp14:editId="179D9BC4">
+          <wp:inline distT="0" distB="0" distL="0" distR="0" wp14:anchorId="7CA95B86" wp14:editId="082928D5">
             <wp:extent cx="4860000" cy="3375000"/>
             <wp:effectExtent l="0" t="0" r="0" b="0"/>
             <wp:docPr id="5" name="Picture 5"/>
@@ -5828,7 +5840,7 @@
           <w:noProof/>
         </w:rPr>
         <w:drawing>
-          <wp:inline distT="0" distB="0" distL="0" distR="0" wp14:anchorId="146D7371" wp14:editId="45F2633C">
+          <wp:inline distT="0" distB="0" distL="0" distR="0" wp14:anchorId="2E101E50" wp14:editId="3B67BFF9">
             <wp:extent cx="4860000" cy="2700000"/>
             <wp:effectExtent l="0" t="0" r="0" b="0"/>
             <wp:docPr id="6" name="Picture 6"/>
@@ -5885,7 +5897,7 @@
         </w:rPr>
         <w:lastRenderedPageBreak/>
         <w:drawing>
-          <wp:inline distT="0" distB="0" distL="0" distR="0" wp14:anchorId="7ED5BC93" wp14:editId="68B0540D">
+          <wp:inline distT="0" distB="0" distL="0" distR="0" wp14:anchorId="163C964A" wp14:editId="2D5E5EC3">
             <wp:extent cx="4860000" cy="2700000"/>
             <wp:effectExtent l="0" t="0" r="0" b="0"/>
             <wp:docPr id="7" name="Picture 7"/>
@@ -5941,7 +5953,7 @@
           <w:noProof/>
         </w:rPr>
         <w:drawing>
-          <wp:inline distT="0" distB="0" distL="0" distR="0" wp14:anchorId="4F957247" wp14:editId="334DFBCA">
+          <wp:inline distT="0" distB="0" distL="0" distR="0" wp14:anchorId="18663C6E" wp14:editId="2528F66B">
             <wp:extent cx="4860000" cy="2700000"/>
             <wp:effectExtent l="0" t="0" r="0" b="0"/>
             <wp:docPr id="8" name="Picture 8"/>
@@ -5998,7 +6010,7 @@
         </w:rPr>
         <w:lastRenderedPageBreak/>
         <w:drawing>
-          <wp:inline distT="0" distB="0" distL="0" distR="0" wp14:anchorId="51C140BC" wp14:editId="7DDD49A7">
+          <wp:inline distT="0" distB="0" distL="0" distR="0" wp14:anchorId="2F823207" wp14:editId="30C5F123">
             <wp:extent cx="4860000" cy="3037500"/>
             <wp:effectExtent l="0" t="0" r="0" b="0"/>
             <wp:docPr id="9" name="Picture 9"/>
@@ -6054,7 +6066,7 @@
           <w:noProof/>
         </w:rPr>
         <w:drawing>
-          <wp:inline distT="0" distB="0" distL="0" distR="0" wp14:anchorId="2D5F984F" wp14:editId="4762E64A">
+          <wp:inline distT="0" distB="0" distL="0" distR="0" wp14:anchorId="34C0A734" wp14:editId="5DDB4769">
             <wp:extent cx="4860000" cy="3037500"/>
             <wp:effectExtent l="0" t="0" r="0" b="0"/>
             <wp:docPr id="10" name="Picture 10"/>
@@ -6111,7 +6123,7 @@
         </w:rPr>
         <w:lastRenderedPageBreak/>
         <w:drawing>
-          <wp:inline distT="0" distB="0" distL="0" distR="0" wp14:anchorId="38298BAF" wp14:editId="2CE09A82">
+          <wp:inline distT="0" distB="0" distL="0" distR="0" wp14:anchorId="404F78F6" wp14:editId="43E04BD6">
             <wp:extent cx="4860000" cy="3037500"/>
             <wp:effectExtent l="0" t="0" r="0" b="0"/>
             <wp:docPr id="11" name="Picture 11"/>
@@ -6167,7 +6179,7 @@
           <w:noProof/>
         </w:rPr>
         <w:drawing>
-          <wp:inline distT="0" distB="0" distL="0" distR="0" wp14:anchorId="3F943036" wp14:editId="330A704B">
+          <wp:inline distT="0" distB="0" distL="0" distR="0" wp14:anchorId="0ECA1BC0" wp14:editId="7A974167">
             <wp:extent cx="4860000" cy="3037500"/>
             <wp:effectExtent l="0" t="0" r="0" b="0"/>
             <wp:docPr id="12" name="Picture 12"/>
@@ -6224,7 +6236,7 @@
         </w:rPr>
         <w:lastRenderedPageBreak/>
         <w:drawing>
-          <wp:inline distT="0" distB="0" distL="0" distR="0" wp14:anchorId="3282BD92" wp14:editId="5CAF5916">
+          <wp:inline distT="0" distB="0" distL="0" distR="0" wp14:anchorId="17B51683" wp14:editId="192D7071">
             <wp:extent cx="4860000" cy="3037500"/>
             <wp:effectExtent l="0" t="0" r="0" b="0"/>
             <wp:docPr id="13" name="Picture 13"/>
@@ -6280,7 +6292,7 @@
           <w:noProof/>
         </w:rPr>
         <w:drawing>
-          <wp:inline distT="0" distB="0" distL="0" distR="0" wp14:anchorId="4DF99308" wp14:editId="7A8A8546">
+          <wp:inline distT="0" distB="0" distL="0" distR="0" wp14:anchorId="7F3F5226" wp14:editId="3B3F775D">
             <wp:extent cx="4860000" cy="3037500"/>
             <wp:effectExtent l="0" t="0" r="0" b="0"/>
             <wp:docPr id="14" name="Picture 14"/>
@@ -6337,7 +6349,7 @@
         </w:rPr>
         <w:lastRenderedPageBreak/>
         <w:drawing>
-          <wp:inline distT="0" distB="0" distL="0" distR="0" wp14:anchorId="2F27D9CC" wp14:editId="26DB3B41">
+          <wp:inline distT="0" distB="0" distL="0" distR="0" wp14:anchorId="0CD2F27F" wp14:editId="13AD9F19">
             <wp:extent cx="4860000" cy="3037500"/>
             <wp:effectExtent l="0" t="0" r="0" b="0"/>
             <wp:docPr id="15" name="Picture 15"/>
@@ -6393,7 +6405,7 @@
           <w:noProof/>
         </w:rPr>
         <w:drawing>
-          <wp:inline distT="0" distB="0" distL="0" distR="0" wp14:anchorId="437D05C7" wp14:editId="2E5382FA">
+          <wp:inline distT="0" distB="0" distL="0" distR="0" wp14:anchorId="06BD34F6" wp14:editId="23A581A8">
             <wp:extent cx="4860000" cy="3037500"/>
             <wp:effectExtent l="0" t="0" r="0" b="0"/>
             <wp:docPr id="16" name="Picture 16"/>
@@ -6450,7 +6462,7 @@
         </w:rPr>
         <w:lastRenderedPageBreak/>
         <w:drawing>
-          <wp:inline distT="0" distB="0" distL="0" distR="0" wp14:anchorId="54D488EF" wp14:editId="78962A0A">
+          <wp:inline distT="0" distB="0" distL="0" distR="0" wp14:anchorId="1F6BDE07" wp14:editId="08317DC6">
             <wp:extent cx="4860000" cy="2700000"/>
             <wp:effectExtent l="0" t="0" r="0" b="0"/>
             <wp:docPr id="17" name="Picture 17"/>
@@ -6507,7 +6519,7 @@
         </w:rPr>
         <w:lastRenderedPageBreak/>
         <w:drawing>
-          <wp:inline distT="0" distB="0" distL="0" distR="0" wp14:anchorId="33D7AD15" wp14:editId="7417C462">
+          <wp:inline distT="0" distB="0" distL="0" distR="0" wp14:anchorId="6DB2D67D" wp14:editId="00DB7725">
             <wp:extent cx="4860000" cy="6289412"/>
             <wp:effectExtent l="0" t="0" r="0" b="0"/>
             <wp:docPr id="18" name="Picture 18"/>
@@ -6564,7 +6576,7 @@
         </w:rPr>
         <w:lastRenderedPageBreak/>
         <w:drawing>
-          <wp:inline distT="0" distB="0" distL="0" distR="0" wp14:anchorId="4ED5E7ED" wp14:editId="7F2F408B">
+          <wp:inline distT="0" distB="0" distL="0" distR="0" wp14:anchorId="7E76721F" wp14:editId="21050B7F">
             <wp:extent cx="4860000" cy="3037500"/>
             <wp:effectExtent l="0" t="0" r="0" b="0"/>
             <wp:docPr id="19" name="Picture 19"/>
@@ -6620,7 +6632,7 @@
           <w:noProof/>
         </w:rPr>
         <w:drawing>
-          <wp:inline distT="0" distB="0" distL="0" distR="0" wp14:anchorId="52CBFF58" wp14:editId="770FADB4">
+          <wp:inline distT="0" distB="0" distL="0" distR="0" wp14:anchorId="5996CC4B" wp14:editId="09284C31">
             <wp:extent cx="4860000" cy="3037500"/>
             <wp:effectExtent l="0" t="0" r="0" b="0"/>
             <wp:docPr id="20" name="Picture 20"/>
@@ -6983,31 +6995,31 @@
       </w:rPr>
     </w:lvl>
   </w:abstractNum>
-  <w:num w:numId="1" w16cid:durableId="1083642157">
+  <w:num w:numId="1" w16cid:durableId="1560743726">
     <w:abstractNumId w:val="8"/>
   </w:num>
-  <w:num w:numId="2" w16cid:durableId="236786880">
+  <w:num w:numId="2" w16cid:durableId="1251306725">
     <w:abstractNumId w:val="6"/>
   </w:num>
-  <w:num w:numId="3" w16cid:durableId="799374658">
+  <w:num w:numId="3" w16cid:durableId="813328059">
     <w:abstractNumId w:val="5"/>
   </w:num>
-  <w:num w:numId="4" w16cid:durableId="382100258">
+  <w:num w:numId="4" w16cid:durableId="440340912">
     <w:abstractNumId w:val="4"/>
   </w:num>
-  <w:num w:numId="5" w16cid:durableId="1173644235">
+  <w:num w:numId="5" w16cid:durableId="1326670542">
     <w:abstractNumId w:val="7"/>
   </w:num>
-  <w:num w:numId="6" w16cid:durableId="1739668419">
+  <w:num w:numId="6" w16cid:durableId="1141271781">
     <w:abstractNumId w:val="3"/>
   </w:num>
-  <w:num w:numId="7" w16cid:durableId="2065055347">
+  <w:num w:numId="7" w16cid:durableId="1695418532">
     <w:abstractNumId w:val="2"/>
   </w:num>
-  <w:num w:numId="8" w16cid:durableId="339895125">
+  <w:num w:numId="8" w16cid:durableId="1843811745">
     <w:abstractNumId w:val="1"/>
   </w:num>
-  <w:num w:numId="9" w16cid:durableId="216476622">
+  <w:num w:numId="9" w16cid:durableId="1445880179">
     <w:abstractNumId w:val="0"/>
   </w:num>
 </w:numbering>
@@ -18403,7 +18415,7 @@
     <w:autoRedefine/>
     <w:uiPriority w:val="39"/>
     <w:unhideWhenUsed/>
-    <w:rsid w:val="00332B92"/>
+    <w:rsid w:val="00214D38"/>
     <w:pPr>
       <w:spacing w:after="100"/>
     </w:pPr>
@@ -18415,7 +18427,7 @@
     <w:autoRedefine/>
     <w:uiPriority w:val="39"/>
     <w:unhideWhenUsed/>
-    <w:rsid w:val="00332B92"/>
+    <w:rsid w:val="00214D38"/>
     <w:pPr>
       <w:spacing w:after="100"/>
       <w:ind w:left="220"/>
@@ -18426,7 +18438,7 @@
     <w:basedOn w:val="Fuentedeprrafopredeter"/>
     <w:uiPriority w:val="99"/>
     <w:unhideWhenUsed/>
-    <w:rsid w:val="00332B92"/>
+    <w:rsid w:val="00214D38"/>
     <w:rPr>
       <w:color w:val="0000FF" w:themeColor="hyperlink"/>
       <w:u w:val="single"/>

</xml_diff>